<commit_message>
Add Lab 3 lifecycle selection and increment plan_Sienna Niggea
</commit_message>
<xml_diff>
--- a/week03/Lab3_Sienna Niggea.docx
+++ b/week03/Lab3_Sienna Niggea.docx
@@ -1,6 +1,6 @@
 
 <file path=word/document.xml><?xml version="1.0" encoding="utf-8"?>
-<w:document xmlns:wpc="http://schemas.microsoft.com/office/word/2010/wordprocessingCanvas" xmlns:cx="http://schemas.microsoft.com/office/drawing/2014/chartex" xmlns:cx1="http://schemas.microsoft.com/office/drawing/2015/9/8/chartex" xmlns:cx2="http://schemas.microsoft.com/office/drawing/2015/10/21/chartex" xmlns:cx3="http://schemas.microsoft.com/office/drawing/2016/5/9/chartex" xmlns:cx4="http://schemas.microsoft.com/office/drawing/2016/5/10/chartex" xmlns:cx5="http://schemas.microsoft.com/office/drawing/2016/5/11/chartex" xmlns:cx6="http://schemas.microsoft.com/office/drawing/2016/5/12/chartex" xmlns:cx7="http://schemas.microsoft.com/office/drawing/2016/5/13/chartex" xmlns:cx8="http://schemas.microsoft.com/office/drawing/2016/5/14/chartex" xmlns:mc="http://schemas.openxmlformats.org/markup-compatibility/2006" xmlns:aink="http://schemas.microsoft.com/office/drawing/2016/ink" xmlns:am3d="http://schemas.microsoft.com/office/drawing/2017/model3d" xmlns:o="urn:schemas-microsoft-com:office:office" xmlns:oel="http://schemas.microsoft.com/office/2019/extlst" xmlns:r="http://schemas.openxmlformats.org/officeDocument/2006/relationships" xmlns:m="http://schemas.openxmlformats.org/officeDocument/2006/math" xmlns:v="urn:schemas-microsoft-com:vml" xmlns:wp14="http://schemas.microsoft.com/office/word/2010/wordprocessingDrawing" xmlns:wp="http://schemas.openxmlformats.org/drawingml/2006/wordprocessingDrawing" xmlns:w10="urn:schemas-microsoft-com:office:word" xmlns:w="http://schemas.openxmlformats.org/wordprocessingml/2006/main" xmlns:w14="http://schemas.microsoft.com/office/word/2010/wordml" xmlns:w15="http://schemas.microsoft.com/office/word/2012/wordml" xmlns:w16cei="http://schemas.microsoft.com/office/word/2026/wordml/cei" xmlns:w16cex="http://schemas.microsoft.com/office/word/2018/wordml/cex" xmlns:w16cid="http://schemas.microsoft.com/office/word/2016/wordml/cid" xmlns:w16="http://schemas.microsoft.com/office/word/2018/wordml" xmlns:w16du="http://schemas.microsoft.com/office/word/2023/wordml/word16du" xmlns:w16sdtdh="http://schemas.microsoft.com/office/word/2020/wordml/sdtdatahash" xmlns:w16sdtfl="http://schemas.microsoft.com/office/word/2024/wordml/sdtformatlock" xmlns:w16se="http://schemas.microsoft.com/office/word/2015/wordml/symex" xmlns:wpg="http://schemas.microsoft.com/office/word/2010/wordprocessingGroup" xmlns:wpi="http://schemas.microsoft.com/office/word/2010/wordprocessingInk" xmlns:wne="http://schemas.microsoft.com/office/word/2006/wordml" xmlns:wps="http://schemas.microsoft.com/office/word/2010/wordprocessingShape" mc:Ignorable="w14 w15 w16se w16cid w16 w16cex w16sdtdh w16sdtfl w16du wp14">
+<w:document xmlns:wpc="http://schemas.microsoft.com/office/word/2010/wordprocessingCanvas" xmlns:cx="http://schemas.microsoft.com/office/drawing/2014/chartex" xmlns:cx1="http://schemas.microsoft.com/office/drawing/2015/9/8/chartex" xmlns:cx2="http://schemas.microsoft.com/office/drawing/2015/10/21/chartex" xmlns:cx3="http://schemas.microsoft.com/office/drawing/2016/5/9/chartex" xmlns:cx4="http://schemas.microsoft.com/office/drawing/2016/5/10/chartex" xmlns:cx5="http://schemas.microsoft.com/office/drawing/2016/5/11/chartex" xmlns:cx6="http://schemas.microsoft.com/office/drawing/2016/5/12/chartex" xmlns:cx7="http://schemas.microsoft.com/office/drawing/2016/5/13/chartex" xmlns:cx8="http://schemas.microsoft.com/office/drawing/2016/5/14/chartex" xmlns:mc="http://schemas.openxmlformats.org/markup-compatibility/2006" xmlns:aink="http://schemas.microsoft.com/office/drawing/2016/ink" xmlns:am3d="http://schemas.microsoft.com/office/drawing/2017/model3d" xmlns:o="urn:schemas-microsoft-com:office:office" xmlns:oel="http://schemas.microsoft.com/office/2019/extlst" xmlns:r="http://schemas.openxmlformats.org/officeDocument/2006/relationships" xmlns:m="http://schemas.openxmlformats.org/officeDocument/2006/math" xmlns:v="urn:schemas-microsoft-com:vml" xmlns:wp14="http://schemas.microsoft.com/office/word/2010/wordprocessingDrawing" xmlns:wp="http://schemas.openxmlformats.org/drawingml/2006/wordprocessingDrawing" xmlns:w10="urn:schemas-microsoft-com:office:word" xmlns:w="http://schemas.openxmlformats.org/wordprocessingml/2006/main" xmlns:w14="http://schemas.microsoft.com/office/word/2010/wordml" xmlns:w15="http://schemas.microsoft.com/office/word/2012/wordml" xmlns:w16cex="http://schemas.microsoft.com/office/word/2018/wordml/cex" xmlns:w16cid="http://schemas.microsoft.com/office/word/2016/wordml/cid" xmlns:w16="http://schemas.microsoft.com/office/word/2018/wordml" xmlns:w16du="http://schemas.microsoft.com/office/word/2023/wordml/word16du" xmlns:w16sdtdh="http://schemas.microsoft.com/office/word/2020/wordml/sdtdatahash" xmlns:w16sdtfl="http://schemas.microsoft.com/office/word/2024/wordml/sdtformatlock" xmlns:w16se="http://schemas.microsoft.com/office/word/2015/wordml/symex" xmlns:wpg="http://schemas.microsoft.com/office/word/2010/wordprocessingGroup" xmlns:wpi="http://schemas.microsoft.com/office/word/2010/wordprocessingInk" xmlns:wne="http://schemas.microsoft.com/office/word/2006/wordml" xmlns:wps="http://schemas.microsoft.com/office/word/2010/wordprocessingShape" mc:Ignorable="w14 w15 w16se w16cid w16 w16cex w16sdtdh w16sdtfl w16du wp14">
   <w:body>
     <w:p>
       <w:pPr>
@@ -2080,7 +2080,6 @@
         </w:rPr>
         <w:t xml:space="preserve"> </w:t>
       </w:r>
-      <w:proofErr w:type="spellStart"/>
       <w:r>
         <w:rPr>
           <w:i/>
@@ -2088,7 +2087,6 @@
         </w:rPr>
         <w:t>Waghi</w:t>
       </w:r>
-      <w:proofErr w:type="spellEnd"/>
       <w:r>
         <w:rPr>
           <w:i/>
@@ -3632,14 +3630,7 @@
         <w:rPr>
           <w:sz w:val="21"/>
         </w:rPr>
-        <w:t>(</w:t>
-      </w:r>
-      <w:proofErr w:type="gramStart"/>
-      <w:r>
-        <w:rPr>
-          <w:sz w:val="21"/>
-        </w:rPr>
-        <w:t>may</w:t>
+        <w:t>(may</w:t>
       </w:r>
       <w:r>
         <w:rPr>
@@ -3654,7 +3645,6 @@
         </w:rPr>
         <w:t>be</w:t>
       </w:r>
-      <w:proofErr w:type="gramEnd"/>
       <w:r>
         <w:rPr>
           <w:spacing w:val="-5"/>
@@ -4071,25 +4061,7 @@
                 <w:color w:val="FFFFFF"/>
                 <w:sz w:val="20"/>
               </w:rPr>
-              <w:t xml:space="preserve">argues AGAINST your </w:t>
-            </w:r>
-            <w:proofErr w:type="gramStart"/>
-            <w:r>
-              <w:rPr>
-                <w:b/>
-                <w:color w:val="FFFFFF"/>
-                <w:sz w:val="20"/>
-              </w:rPr>
-              <w:t>choice, and</w:t>
-            </w:r>
-            <w:proofErr w:type="gramEnd"/>
-            <w:r>
-              <w:rPr>
-                <w:b/>
-                <w:color w:val="FFFFFF"/>
-                <w:sz w:val="20"/>
-              </w:rPr>
-              <w:t xml:space="preserve"> say how you will manage it.</w:t>
+              <w:t>argues AGAINST your choice, and say how you will manage it.</w:t>
             </w:r>
           </w:p>
         </w:tc>
@@ -4171,21 +4143,7 @@
               <w:rPr>
                 <w:sz w:val="20"/>
               </w:rPr>
-              <w:t xml:space="preserve">partly clear, not much is given and the developer also </w:t>
-            </w:r>
-            <w:proofErr w:type="gramStart"/>
-            <w:r>
-              <w:rPr>
-                <w:sz w:val="20"/>
-              </w:rPr>
-              <w:t>has to</w:t>
-            </w:r>
-            <w:proofErr w:type="gramEnd"/>
-            <w:r>
-              <w:rPr>
-                <w:sz w:val="20"/>
-              </w:rPr>
-              <w:t xml:space="preserve"> figure out what other requirements the stakeholder may need. </w:t>
+              <w:t xml:space="preserve">partly clear, not much is given and the developer also has to figure out what other requirements the stakeholder may need. </w:t>
             </w:r>
             <w:r>
               <w:rPr>
@@ -5597,7 +5555,13 @@
               <w:rPr>
                 <w:sz w:val="20"/>
               </w:rPr>
-              <w:t>6 weeks</w:t>
+              <w:t>5</w:t>
+            </w:r>
+            <w:r>
+              <w:rPr>
+                <w:sz w:val="20"/>
+              </w:rPr>
+              <w:t xml:space="preserve"> weeks</w:t>
             </w:r>
           </w:p>
         </w:tc>
@@ -6849,21 +6813,7 @@
         <w:rPr>
           <w:sz w:val="21"/>
         </w:rPr>
-        <w:t>Lab3_&lt;</w:t>
-      </w:r>
-      <w:proofErr w:type="spellStart"/>
-      <w:r>
-        <w:rPr>
-          <w:sz w:val="21"/>
-        </w:rPr>
-        <w:t>YourName</w:t>
-      </w:r>
-      <w:proofErr w:type="spellEnd"/>
-      <w:r>
-        <w:rPr>
-          <w:sz w:val="21"/>
-        </w:rPr>
-        <w:t>&gt;.docx</w:t>
+        <w:t>Lab3_&lt;YourName&gt;.docx</w:t>
       </w:r>
       <w:r>
         <w:rPr>
@@ -7667,7 +7617,7 @@
 </file>
 
 <file path=word/numbering.xml><?xml version="1.0" encoding="utf-8"?>
-<w:numbering xmlns:wpc="http://schemas.microsoft.com/office/word/2010/wordprocessingCanvas" xmlns:cx="http://schemas.microsoft.com/office/drawing/2014/chartex" xmlns:cx1="http://schemas.microsoft.com/office/drawing/2015/9/8/chartex" xmlns:cx2="http://schemas.microsoft.com/office/drawing/2015/10/21/chartex" xmlns:cx3="http://schemas.microsoft.com/office/drawing/2016/5/9/chartex" xmlns:cx4="http://schemas.microsoft.com/office/drawing/2016/5/10/chartex" xmlns:cx5="http://schemas.microsoft.com/office/drawing/2016/5/11/chartex" xmlns:cx6="http://schemas.microsoft.com/office/drawing/2016/5/12/chartex" xmlns:cx7="http://schemas.microsoft.com/office/drawing/2016/5/13/chartex" xmlns:cx8="http://schemas.microsoft.com/office/drawing/2016/5/14/chartex" xmlns:mc="http://schemas.openxmlformats.org/markup-compatibility/2006" xmlns:aink="http://schemas.microsoft.com/office/drawing/2016/ink" xmlns:am3d="http://schemas.microsoft.com/office/drawing/2017/model3d" xmlns:o="urn:schemas-microsoft-com:office:office" xmlns:oel="http://schemas.microsoft.com/office/2019/extlst" xmlns:r="http://schemas.openxmlformats.org/officeDocument/2006/relationships" xmlns:m="http://schemas.openxmlformats.org/officeDocument/2006/math" xmlns:v="urn:schemas-microsoft-com:vml" xmlns:wp14="http://schemas.microsoft.com/office/word/2010/wordprocessingDrawing" xmlns:wp="http://schemas.openxmlformats.org/drawingml/2006/wordprocessingDrawing" xmlns:w10="urn:schemas-microsoft-com:office:word" xmlns:w="http://schemas.openxmlformats.org/wordprocessingml/2006/main" xmlns:w14="http://schemas.microsoft.com/office/word/2010/wordml" xmlns:w15="http://schemas.microsoft.com/office/word/2012/wordml" xmlns:w16cei="http://schemas.microsoft.com/office/word/2026/wordml/cei" xmlns:w16cex="http://schemas.microsoft.com/office/word/2018/wordml/cex" xmlns:w16cid="http://schemas.microsoft.com/office/word/2016/wordml/cid" xmlns:w16="http://schemas.microsoft.com/office/word/2018/wordml" xmlns:w16du="http://schemas.microsoft.com/office/word/2023/wordml/word16du" xmlns:w16sdtdh="http://schemas.microsoft.com/office/word/2020/wordml/sdtdatahash" xmlns:w16sdtfl="http://schemas.microsoft.com/office/word/2024/wordml/sdtformatlock" xmlns:w16se="http://schemas.microsoft.com/office/word/2015/wordml/symex" xmlns:wpg="http://schemas.microsoft.com/office/word/2010/wordprocessingGroup" xmlns:wpi="http://schemas.microsoft.com/office/word/2010/wordprocessingInk" xmlns:wne="http://schemas.microsoft.com/office/word/2006/wordml" xmlns:wps="http://schemas.microsoft.com/office/word/2010/wordprocessingShape" mc:Ignorable="w14 w15 w16se w16cid w16 w16cex w16sdtdh w16sdtfl w16du wp14">
+<w:numbering xmlns:wpc="http://schemas.microsoft.com/office/word/2010/wordprocessingCanvas" xmlns:cx="http://schemas.microsoft.com/office/drawing/2014/chartex" xmlns:cx1="http://schemas.microsoft.com/office/drawing/2015/9/8/chartex" xmlns:cx2="http://schemas.microsoft.com/office/drawing/2015/10/21/chartex" xmlns:cx3="http://schemas.microsoft.com/office/drawing/2016/5/9/chartex" xmlns:cx4="http://schemas.microsoft.com/office/drawing/2016/5/10/chartex" xmlns:cx5="http://schemas.microsoft.com/office/drawing/2016/5/11/chartex" xmlns:cx6="http://schemas.microsoft.com/office/drawing/2016/5/12/chartex" xmlns:cx7="http://schemas.microsoft.com/office/drawing/2016/5/13/chartex" xmlns:cx8="http://schemas.microsoft.com/office/drawing/2016/5/14/chartex" xmlns:mc="http://schemas.openxmlformats.org/markup-compatibility/2006" xmlns:aink="http://schemas.microsoft.com/office/drawing/2016/ink" xmlns:am3d="http://schemas.microsoft.com/office/drawing/2017/model3d" xmlns:o="urn:schemas-microsoft-com:office:office" xmlns:oel="http://schemas.microsoft.com/office/2019/extlst" xmlns:r="http://schemas.openxmlformats.org/officeDocument/2006/relationships" xmlns:m="http://schemas.openxmlformats.org/officeDocument/2006/math" xmlns:v="urn:schemas-microsoft-com:vml" xmlns:wp14="http://schemas.microsoft.com/office/word/2010/wordprocessingDrawing" xmlns:wp="http://schemas.openxmlformats.org/drawingml/2006/wordprocessingDrawing" xmlns:w10="urn:schemas-microsoft-com:office:word" xmlns:w="http://schemas.openxmlformats.org/wordprocessingml/2006/main" xmlns:w14="http://schemas.microsoft.com/office/word/2010/wordml" xmlns:w15="http://schemas.microsoft.com/office/word/2012/wordml" xmlns:w16cex="http://schemas.microsoft.com/office/word/2018/wordml/cex" xmlns:w16cid="http://schemas.microsoft.com/office/word/2016/wordml/cid" xmlns:w16="http://schemas.microsoft.com/office/word/2018/wordml" xmlns:w16du="http://schemas.microsoft.com/office/word/2023/wordml/word16du" xmlns:w16sdtdh="http://schemas.microsoft.com/office/word/2020/wordml/sdtdatahash" xmlns:w16sdtfl="http://schemas.microsoft.com/office/word/2024/wordml/sdtformatlock" xmlns:w16se="http://schemas.microsoft.com/office/word/2015/wordml/symex" xmlns:wpg="http://schemas.microsoft.com/office/word/2010/wordprocessingGroup" xmlns:wpi="http://schemas.microsoft.com/office/word/2010/wordprocessingInk" xmlns:wne="http://schemas.microsoft.com/office/word/2006/wordml" xmlns:wps="http://schemas.microsoft.com/office/word/2010/wordprocessingShape" mc:Ignorable="w14 w15 w16se w16cid w16 w16cex w16sdtdh w16sdtfl w16du wp14">
   <w:abstractNum w:abstractNumId="0" w15:restartNumberingAfterBreak="0">
     <w:nsid w:val="16294A9E"/>
     <w:multiLevelType w:val="hybridMultilevel"/>

</xml_diff>